<commit_message>
Update PAWSIC-Committee-Bylaws.docx per Jeanine: no fixed meeting length; committee eligibility = Premium + Students + waivable free members (CNAs)
</commit_message>
<xml_diff>
--- a/governance/PAWSIC-Committee-Bylaws.docx
+++ b/governance/PAWSIC-Committee-Bylaws.docx
@@ -302,27 +302,7 @@
           <w:sz w:val="21"/>
           <w:szCs w:val="21"/>
         </w:rPr>
-        <w:t xml:space="preserve">Section 1. Membership is open to PAWSIC </w:t>
-      </w:r>
-      <w:r>
-        <w:rPr>
-          <w:rFonts w:ascii="Calibri" w:cs="Calibri" w:eastAsia="Calibri" w:hAnsi="Calibri"/>
-          <w:b/>
-          <w:bCs/>
-          <w:color w:val="0C1F3F"/>
-          <w:sz w:val="21"/>
-          <w:szCs w:val="21"/>
-        </w:rPr>
-        <w:t xml:space="preserve">[Premium members / Board members / specify]</w:t>
-      </w:r>
-      <w:r>
-        <w:rPr>
-          <w:rFonts w:ascii="Calibri" w:cs="Calibri" w:eastAsia="Calibri" w:hAnsi="Calibri"/>
-          <w:color w:val="2D3748"/>
-          <w:sz w:val="21"/>
-          <w:szCs w:val="21"/>
-        </w:rPr>
-        <w:t xml:space="preserve"> who apply and are approved by the Chair.</w:t>
+        <w:t xml:space="preserve">Section 1. Membership is open to PAWSIC Premium members and Students. Certain free members, such as Certified Nursing Assistants (CNAs), may also be approved to serve on the committee at PAWSIC’s discretion. Members apply and are approved by the Chair.</w:t>
       </w:r>
     </w:p>
     <w:p>

</xml_diff>